<commit_message>
Adding all documents and presentation files from final submission of project
</commit_message>
<xml_diff>
--- a/docs/Vishant-Prasad-Web-Application-And-Inerface-Design-Project-Submission-Document.docx
+++ b/docs/Vishant-Prasad-Web-Application-And-Inerface-Design-Project-Submission-Document.docx
@@ -379,6 +379,8 @@
             <w:t>Contents</w:t>
           </w:r>
         </w:p>
+        <w:bookmarkStart w:id="0" w:name="_GoBack"/>
+        <w:bookmarkEnd w:id="0"/>
         <w:p>
           <w:pPr>
             <w:pStyle w:val="TOC1"/>
@@ -415,12 +417,152 @@
             </w:rPr>
             <w:fldChar w:fldCharType="separate"/>
           </w:r>
-          <w:hyperlink w:anchor="_Toc217334118" w:history="1">
+          <w:hyperlink w:anchor="_Toc217440305" w:history="1">
             <w:r>
               <w:rPr>
                 <w:rStyle w:val="Hyperlink"/>
                 <w:noProof/>
               </w:rPr>
+              <w:t>Link to Repository</w:t>
+            </w:r>
+            <w:r>
+              <w:rPr>
+                <w:noProof/>
+                <w:webHidden/>
+              </w:rPr>
+              <w:tab/>
+            </w:r>
+            <w:r>
+              <w:rPr>
+                <w:noProof/>
+                <w:webHidden/>
+              </w:rPr>
+              <w:fldChar w:fldCharType="begin"/>
+            </w:r>
+            <w:r>
+              <w:rPr>
+                <w:noProof/>
+                <w:webHidden/>
+              </w:rPr>
+              <w:instrText xml:space="preserve"> PAGEREF _Toc217440305 \h </w:instrText>
+            </w:r>
+            <w:r>
+              <w:rPr>
+                <w:noProof/>
+                <w:webHidden/>
+              </w:rPr>
+            </w:r>
+            <w:r>
+              <w:rPr>
+                <w:noProof/>
+                <w:webHidden/>
+              </w:rPr>
+              <w:fldChar w:fldCharType="separate"/>
+            </w:r>
+            <w:r>
+              <w:rPr>
+                <w:noProof/>
+                <w:webHidden/>
+              </w:rPr>
+              <w:t>2</w:t>
+            </w:r>
+            <w:r>
+              <w:rPr>
+                <w:noProof/>
+                <w:webHidden/>
+              </w:rPr>
+              <w:fldChar w:fldCharType="end"/>
+            </w:r>
+          </w:hyperlink>
+        </w:p>
+        <w:p>
+          <w:pPr>
+            <w:pStyle w:val="TOC1"/>
+            <w:tabs>
+              <w:tab w:val="right" w:leader="dot" w:pos="9016"/>
+            </w:tabs>
+            <w:rPr>
+              <w:rFonts w:eastAsiaTheme="minorEastAsia"/>
+              <w:noProof/>
+              <w:lang w:eastAsia="en-AU"/>
+            </w:rPr>
+          </w:pPr>
+          <w:hyperlink w:anchor="_Toc217440306" w:history="1">
+            <w:r>
+              <w:rPr>
+                <w:rStyle w:val="Hyperlink"/>
+                <w:noProof/>
+              </w:rPr>
+              <w:t>Link to Presentation</w:t>
+            </w:r>
+            <w:r>
+              <w:rPr>
+                <w:noProof/>
+                <w:webHidden/>
+              </w:rPr>
+              <w:tab/>
+            </w:r>
+            <w:r>
+              <w:rPr>
+                <w:noProof/>
+                <w:webHidden/>
+              </w:rPr>
+              <w:fldChar w:fldCharType="begin"/>
+            </w:r>
+            <w:r>
+              <w:rPr>
+                <w:noProof/>
+                <w:webHidden/>
+              </w:rPr>
+              <w:instrText xml:space="preserve"> PAGEREF _Toc217440306 \h </w:instrText>
+            </w:r>
+            <w:r>
+              <w:rPr>
+                <w:noProof/>
+                <w:webHidden/>
+              </w:rPr>
+            </w:r>
+            <w:r>
+              <w:rPr>
+                <w:noProof/>
+                <w:webHidden/>
+              </w:rPr>
+              <w:fldChar w:fldCharType="separate"/>
+            </w:r>
+            <w:r>
+              <w:rPr>
+                <w:noProof/>
+                <w:webHidden/>
+              </w:rPr>
+              <w:t>2</w:t>
+            </w:r>
+            <w:r>
+              <w:rPr>
+                <w:noProof/>
+                <w:webHidden/>
+              </w:rPr>
+              <w:fldChar w:fldCharType="end"/>
+            </w:r>
+          </w:hyperlink>
+        </w:p>
+        <w:p>
+          <w:pPr>
+            <w:pStyle w:val="TOC1"/>
+            <w:tabs>
+              <w:tab w:val="right" w:leader="dot" w:pos="9016"/>
+            </w:tabs>
+            <w:rPr>
+              <w:rFonts w:eastAsiaTheme="minorEastAsia"/>
+              <w:noProof/>
+              <w:lang w:eastAsia="en-AU"/>
+            </w:rPr>
+          </w:pPr>
+          <w:hyperlink w:anchor="_Toc217440307" w:history="1">
+            <w:r>
+              <w:rPr>
+                <w:rStyle w:val="Hyperlink"/>
+                <w:noProof/>
+              </w:rPr>
               <w:t>Supporting Documentation</w:t>
             </w:r>
             <w:r>
@@ -442,7 +584,7 @@
                 <w:noProof/>
                 <w:webHidden/>
               </w:rPr>
-              <w:instrText xml:space="preserve"> PAGEREF _Toc217334118 \h </w:instrText>
+              <w:instrText xml:space="preserve"> PAGEREF _Toc217440307 \h </w:instrText>
             </w:r>
             <w:r>
               <w:rPr>
@@ -485,7 +627,7 @@
               <w:lang w:eastAsia="en-AU"/>
             </w:rPr>
           </w:pPr>
-          <w:hyperlink w:anchor="_Toc217334119" w:history="1">
+          <w:hyperlink w:anchor="_Toc217440308" w:history="1">
             <w:r>
               <w:rPr>
                 <w:rStyle w:val="Hyperlink"/>
@@ -512,7 +654,7 @@
                 <w:noProof/>
                 <w:webHidden/>
               </w:rPr>
-              <w:instrText xml:space="preserve"> PAGEREF _Toc217334119 \h </w:instrText>
+              <w:instrText xml:space="preserve"> PAGEREF _Toc217440308 \h </w:instrText>
             </w:r>
             <w:r>
               <w:rPr>
@@ -555,7 +697,7 @@
               <w:lang w:eastAsia="en-AU"/>
             </w:rPr>
           </w:pPr>
-          <w:hyperlink w:anchor="_Toc217334120" w:history="1">
+          <w:hyperlink w:anchor="_Toc217440309" w:history="1">
             <w:r>
               <w:rPr>
                 <w:rStyle w:val="Hyperlink"/>
@@ -582,7 +724,7 @@
                 <w:noProof/>
                 <w:webHidden/>
               </w:rPr>
-              <w:instrText xml:space="preserve"> PAGEREF _Toc217334120 \h </w:instrText>
+              <w:instrText xml:space="preserve"> PAGEREF _Toc217440309 \h </w:instrText>
             </w:r>
             <w:r>
               <w:rPr>
@@ -625,7 +767,7 @@
               <w:lang w:eastAsia="en-AU"/>
             </w:rPr>
           </w:pPr>
-          <w:hyperlink w:anchor="_Toc217334121" w:history="1">
+          <w:hyperlink w:anchor="_Toc217440310" w:history="1">
             <w:r>
               <w:rPr>
                 <w:rStyle w:val="Hyperlink"/>
@@ -652,7 +794,7 @@
                 <w:noProof/>
                 <w:webHidden/>
               </w:rPr>
-              <w:instrText xml:space="preserve"> PAGEREF _Toc217334121 \h </w:instrText>
+              <w:instrText xml:space="preserve"> PAGEREF _Toc217440310 \h </w:instrText>
             </w:r>
             <w:r>
               <w:rPr>
@@ -695,7 +837,7 @@
               <w:lang w:eastAsia="en-AU"/>
             </w:rPr>
           </w:pPr>
-          <w:hyperlink w:anchor="_Toc217334122" w:history="1">
+          <w:hyperlink w:anchor="_Toc217440311" w:history="1">
             <w:r>
               <w:rPr>
                 <w:rStyle w:val="Hyperlink"/>
@@ -722,7 +864,7 @@
                 <w:noProof/>
                 <w:webHidden/>
               </w:rPr>
-              <w:instrText xml:space="preserve"> PAGEREF _Toc217334122 \h </w:instrText>
+              <w:instrText xml:space="preserve"> PAGEREF _Toc217440311 \h </w:instrText>
             </w:r>
             <w:r>
               <w:rPr>
@@ -765,7 +907,7 @@
               <w:lang w:eastAsia="en-AU"/>
             </w:rPr>
           </w:pPr>
-          <w:hyperlink w:anchor="_Toc217334123" w:history="1">
+          <w:hyperlink w:anchor="_Toc217440312" w:history="1">
             <w:r>
               <w:rPr>
                 <w:rStyle w:val="Hyperlink"/>
@@ -792,7 +934,7 @@
                 <w:noProof/>
                 <w:webHidden/>
               </w:rPr>
-              <w:instrText xml:space="preserve"> PAGEREF _Toc217334123 \h </w:instrText>
+              <w:instrText xml:space="preserve"> PAGEREF _Toc217440312 \h </w:instrText>
             </w:r>
             <w:r>
               <w:rPr>
@@ -812,7 +954,7 @@
                 <w:noProof/>
                 <w:webHidden/>
               </w:rPr>
-              <w:t>2</w:t>
+              <w:t>3</w:t>
             </w:r>
             <w:r>
               <w:rPr>
@@ -835,7 +977,7 @@
               <w:lang w:eastAsia="en-AU"/>
             </w:rPr>
           </w:pPr>
-          <w:hyperlink w:anchor="_Toc217334124" w:history="1">
+          <w:hyperlink w:anchor="_Toc217440313" w:history="1">
             <w:r>
               <w:rPr>
                 <w:rStyle w:val="Hyperlink"/>
@@ -862,7 +1004,7 @@
                 <w:noProof/>
                 <w:webHidden/>
               </w:rPr>
-              <w:instrText xml:space="preserve"> PAGEREF _Toc217334124 \h </w:instrText>
+              <w:instrText xml:space="preserve"> PAGEREF _Toc217440313 \h </w:instrText>
             </w:r>
             <w:r>
               <w:rPr>
@@ -882,7 +1024,7 @@
                 <w:noProof/>
                 <w:webHidden/>
               </w:rPr>
-              <w:t>2</w:t>
+              <w:t>3</w:t>
             </w:r>
             <w:r>
               <w:rPr>
@@ -905,7 +1047,7 @@
               <w:lang w:eastAsia="en-AU"/>
             </w:rPr>
           </w:pPr>
-          <w:hyperlink w:anchor="_Toc217334125" w:history="1">
+          <w:hyperlink w:anchor="_Toc217440314" w:history="1">
             <w:r>
               <w:rPr>
                 <w:rStyle w:val="Hyperlink"/>
@@ -932,7 +1074,7 @@
                 <w:noProof/>
                 <w:webHidden/>
               </w:rPr>
-              <w:instrText xml:space="preserve"> PAGEREF _Toc217334125 \h </w:instrText>
+              <w:instrText xml:space="preserve"> PAGEREF _Toc217440314 \h </w:instrText>
             </w:r>
             <w:r>
               <w:rPr>
@@ -952,7 +1094,7 @@
                 <w:noProof/>
                 <w:webHidden/>
               </w:rPr>
-              <w:t>2</w:t>
+              <w:t>3</w:t>
             </w:r>
             <w:r>
               <w:rPr>
@@ -975,7 +1117,7 @@
               <w:lang w:eastAsia="en-AU"/>
             </w:rPr>
           </w:pPr>
-          <w:hyperlink w:anchor="_Toc217334126" w:history="1">
+          <w:hyperlink w:anchor="_Toc217440315" w:history="1">
             <w:r>
               <w:rPr>
                 <w:rStyle w:val="Hyperlink"/>
@@ -1002,7 +1144,7 @@
                 <w:noProof/>
                 <w:webHidden/>
               </w:rPr>
-              <w:instrText xml:space="preserve"> PAGEREF _Toc217334126 \h </w:instrText>
+              <w:instrText xml:space="preserve"> PAGEREF _Toc217440315 \h </w:instrText>
             </w:r>
             <w:r>
               <w:rPr>
@@ -1045,7 +1187,7 @@
               <w:lang w:eastAsia="en-AU"/>
             </w:rPr>
           </w:pPr>
-          <w:hyperlink w:anchor="_Toc217334127" w:history="1">
+          <w:hyperlink w:anchor="_Toc217440316" w:history="1">
             <w:r>
               <w:rPr>
                 <w:rStyle w:val="Hyperlink"/>
@@ -1072,7 +1214,7 @@
                 <w:noProof/>
                 <w:webHidden/>
               </w:rPr>
-              <w:instrText xml:space="preserve"> PAGEREF _Toc217334127 \h </w:instrText>
+              <w:instrText xml:space="preserve"> PAGEREF _Toc217440316 \h </w:instrText>
             </w:r>
             <w:r>
               <w:rPr>
@@ -1115,7 +1257,7 @@
               <w:lang w:eastAsia="en-AU"/>
             </w:rPr>
           </w:pPr>
-          <w:hyperlink w:anchor="_Toc217334128" w:history="1">
+          <w:hyperlink w:anchor="_Toc217440317" w:history="1">
             <w:r>
               <w:rPr>
                 <w:rStyle w:val="Hyperlink"/>
@@ -1142,7 +1284,7 @@
                 <w:noProof/>
                 <w:webHidden/>
               </w:rPr>
-              <w:instrText xml:space="preserve"> PAGEREF _Toc217334128 \h </w:instrText>
+              <w:instrText xml:space="preserve"> PAGEREF _Toc217440317 \h </w:instrText>
             </w:r>
             <w:r>
               <w:rPr>
@@ -1162,7 +1304,77 @@
                 <w:noProof/>
                 <w:webHidden/>
               </w:rPr>
-              <w:t>3</w:t>
+              <w:t>4</w:t>
+            </w:r>
+            <w:r>
+              <w:rPr>
+                <w:noProof/>
+                <w:webHidden/>
+              </w:rPr>
+              <w:fldChar w:fldCharType="end"/>
+            </w:r>
+          </w:hyperlink>
+        </w:p>
+        <w:p>
+          <w:pPr>
+            <w:pStyle w:val="TOC1"/>
+            <w:tabs>
+              <w:tab w:val="right" w:leader="dot" w:pos="9016"/>
+            </w:tabs>
+            <w:rPr>
+              <w:rFonts w:eastAsiaTheme="minorEastAsia"/>
+              <w:noProof/>
+              <w:lang w:eastAsia="en-AU"/>
+            </w:rPr>
+          </w:pPr>
+          <w:hyperlink w:anchor="_Toc217440318" w:history="1">
+            <w:r>
+              <w:rPr>
+                <w:rStyle w:val="Hyperlink"/>
+                <w:noProof/>
+              </w:rPr>
+              <w:t>References</w:t>
+            </w:r>
+            <w:r>
+              <w:rPr>
+                <w:noProof/>
+                <w:webHidden/>
+              </w:rPr>
+              <w:tab/>
+            </w:r>
+            <w:r>
+              <w:rPr>
+                <w:noProof/>
+                <w:webHidden/>
+              </w:rPr>
+              <w:fldChar w:fldCharType="begin"/>
+            </w:r>
+            <w:r>
+              <w:rPr>
+                <w:noProof/>
+                <w:webHidden/>
+              </w:rPr>
+              <w:instrText xml:space="preserve"> PAGEREF _Toc217440318 \h </w:instrText>
+            </w:r>
+            <w:r>
+              <w:rPr>
+                <w:noProof/>
+                <w:webHidden/>
+              </w:rPr>
+            </w:r>
+            <w:r>
+              <w:rPr>
+                <w:noProof/>
+                <w:webHidden/>
+              </w:rPr>
+              <w:fldChar w:fldCharType="separate"/>
+            </w:r>
+            <w:r>
+              <w:rPr>
+                <w:noProof/>
+                <w:webHidden/>
+              </w:rPr>
+              <w:t>5</w:t>
             </w:r>
             <w:r>
               <w:rPr>
@@ -1204,7 +1416,6 @@
           <w:b/>
         </w:rPr>
       </w:pPr>
-      <w:bookmarkStart w:id="0" w:name="_Toc217334118"/>
       <w:r>
         <w:rPr>
           <w:rStyle w:val="Emphasis"/>
@@ -1219,22 +1430,104 @@
       <w:pPr>
         <w:pStyle w:val="Heading1"/>
       </w:pPr>
+      <w:bookmarkStart w:id="1" w:name="_Toc217440305"/>
+      <w:r>
+        <w:t>Link to Repository</w:t>
+      </w:r>
+      <w:bookmarkEnd w:id="1"/>
+    </w:p>
+    <w:p>
+      <w:r>
+        <w:rPr>
+          <w:b/>
+        </w:rPr>
+        <w:t xml:space="preserve">GitHub Link: </w:t>
+      </w:r>
+      <w:hyperlink r:id="rId9" w:history="1">
+        <w:r>
+          <w:rPr>
+            <w:rStyle w:val="Hyperlink"/>
+          </w:rPr>
+          <w:t>https://github.com/vish8426/cafe-fausse</w:t>
+        </w:r>
+      </w:hyperlink>
+      <w:r>
+        <w:t xml:space="preserve"> </w:t>
+      </w:r>
+    </w:p>
+    <w:p>
+      <w:pPr>
+        <w:pStyle w:val="Heading1"/>
+      </w:pPr>
+      <w:bookmarkStart w:id="2" w:name="_Toc217440306"/>
+      <w:r>
+        <w:t>Link to Presentation</w:t>
+      </w:r>
+      <w:bookmarkEnd w:id="2"/>
+    </w:p>
+    <w:p>
+      <w:pPr>
+        <w:rPr>
+          <w:rStyle w:val="Hyperlink"/>
+        </w:rPr>
+      </w:pPr>
+      <w:r>
+        <w:rPr>
+          <w:b/>
+        </w:rPr>
+        <w:t xml:space="preserve">Presentation Video Link: </w:t>
+      </w:r>
+      <w:hyperlink r:id="rId10" w:history="1">
+        <w:r>
+          <w:rPr>
+            <w:rStyle w:val="Hyperlink"/>
+          </w:rPr>
+          <w:t>Google Drive Link</w:t>
+        </w:r>
+      </w:hyperlink>
+    </w:p>
+    <w:p>
+      <w:pPr>
+        <w:rPr>
+          <w:sz w:val="18"/>
+        </w:rPr>
+      </w:pPr>
+      <w:hyperlink r:id="rId11" w:history="1">
+        <w:r>
+          <w:rPr>
+            <w:rStyle w:val="Hyperlink"/>
+            <w:sz w:val="18"/>
+          </w:rPr>
+          <w:t>https://drive.google.com/drive/folders/1f8x2zVT15BbylZxtqCVu2aHbTdM2LDjs?usp=sharing</w:t>
+        </w:r>
+      </w:hyperlink>
+    </w:p>
+    <w:p>
+      <w:pPr>
+        <w:pStyle w:val="Heading1"/>
+      </w:pPr>
+      <w:bookmarkStart w:id="3" w:name="_Toc217440307"/>
       <w:r>
         <w:t>Supporting Documentation</w:t>
       </w:r>
-      <w:bookmarkEnd w:id="0"/>
+      <w:bookmarkEnd w:id="3"/>
     </w:p>
     <w:p>
       <w:pPr>
         <w:pStyle w:val="Heading2"/>
       </w:pPr>
-      <w:bookmarkStart w:id="1" w:name="_Toc217334119"/>
+      <w:bookmarkStart w:id="4" w:name="_Toc217440308"/>
       <w:r>
         <w:t>AI Documentation</w:t>
       </w:r>
-      <w:bookmarkEnd w:id="1"/>
-    </w:p>
-    <w:p>
+      <w:bookmarkEnd w:id="4"/>
+    </w:p>
+    <w:p>
+      <w:pPr>
+        <w:rPr>
+          <w:b/>
+        </w:rPr>
+      </w:pPr>
       <w:r>
         <w:rPr>
           <w:b/>
@@ -1247,6 +1540,15 @@
         </w:rPr>
         <w:t xml:space="preserve"> </w:t>
       </w:r>
+    </w:p>
+    <w:p>
+      <w:pPr>
+        <w:pStyle w:val="ListParagraph"/>
+        <w:numPr>
+          <w:ilvl w:val="0"/>
+          <w:numId w:val="18"/>
+        </w:numPr>
+      </w:pPr>
       <w:r>
         <w:t>Claude (Anthropic) – AI Assistant for Code Generation &amp; G</w:t>
       </w:r>
@@ -1256,13 +1558,25 @@
     </w:p>
     <w:p>
       <w:pPr>
+        <w:pStyle w:val="ListParagraph"/>
+        <w:numPr>
+          <w:ilvl w:val="0"/>
+          <w:numId w:val="18"/>
+        </w:numPr>
+      </w:pPr>
+      <w:r>
+        <w:t>Google Gemini – AI Assistant for Image Generation (Fast).</w:t>
+      </w:r>
+    </w:p>
+    <w:p>
+      <w:pPr>
         <w:pStyle w:val="Heading3"/>
       </w:pPr>
-      <w:bookmarkStart w:id="2" w:name="_Toc217334120"/>
+      <w:bookmarkStart w:id="5" w:name="_Toc217440309"/>
       <w:r>
         <w:t>How AI was Used</w:t>
       </w:r>
-      <w:bookmarkEnd w:id="2"/>
+      <w:bookmarkEnd w:id="5"/>
     </w:p>
     <w:p>
       <w:pPr>
@@ -1382,11 +1696,11 @@
       <w:pPr>
         <w:pStyle w:val="Heading3"/>
       </w:pPr>
-      <w:bookmarkStart w:id="3" w:name="_Toc217334121"/>
+      <w:bookmarkStart w:id="6" w:name="_Toc217440310"/>
       <w:r>
         <w:t>Code Breakdown</w:t>
       </w:r>
-      <w:bookmarkEnd w:id="3"/>
+      <w:bookmarkEnd w:id="6"/>
     </w:p>
     <w:p>
       <w:pPr>
@@ -1403,7 +1717,19 @@
         <w:t>AI-Generate</w:t>
       </w:r>
       <w:r>
-        <w:t xml:space="preserve">: Evaluated by the AI model that ~90% of initial </w:t>
+        <w:t xml:space="preserve">: </w:t>
+      </w:r>
+    </w:p>
+    <w:p>
+      <w:pPr>
+        <w:pStyle w:val="ListParagraph"/>
+        <w:numPr>
+          <w:ilvl w:val="1"/>
+          <w:numId w:val="3"/>
+        </w:numPr>
+      </w:pPr>
+      <w:r>
+        <w:t xml:space="preserve">Evaluated by the AI model that ~90% of initial </w:t>
       </w:r>
       <w:r>
         <w:t xml:space="preserve">drafted </w:t>
@@ -1411,6 +1737,75 @@
       <w:r>
         <w:t>code structure, components and backend where generated by Claude AI.</w:t>
       </w:r>
+      <w:r>
+        <w:t xml:space="preserve"> </w:t>
+      </w:r>
+      <w:sdt>
+        <w:sdtPr>
+          <w:id w:val="-1888640544"/>
+          <w:citation/>
+        </w:sdtPr>
+        <w:sdtEndPr/>
+        <w:sdtContent>
+          <w:r>
+            <w:fldChar w:fldCharType="begin"/>
+          </w:r>
+          <w:r>
+            <w:instrText xml:space="preserve"> CITATION Cla25 \l 3081 </w:instrText>
+          </w:r>
+          <w:r>
+            <w:fldChar w:fldCharType="separate"/>
+          </w:r>
+          <w:r>
+            <w:rPr>
+              <w:noProof/>
+            </w:rPr>
+            <w:t>(Claude AI - Prompts for Project Draft Website Structure (Program Setup Troubleshooting), 2025)</w:t>
+          </w:r>
+          <w:r>
+            <w:fldChar w:fldCharType="end"/>
+          </w:r>
+        </w:sdtContent>
+      </w:sdt>
+    </w:p>
+    <w:p>
+      <w:pPr>
+        <w:pStyle w:val="ListParagraph"/>
+        <w:numPr>
+          <w:ilvl w:val="1"/>
+          <w:numId w:val="3"/>
+        </w:numPr>
+      </w:pPr>
+      <w:r>
+        <w:t xml:space="preserve">Other images for the gallery has been generated by Google Gemini AI in the same style as the examples given by Quantic. </w:t>
+      </w:r>
+      <w:sdt>
+        <w:sdtPr>
+          <w:id w:val="620578217"/>
+          <w:citation/>
+        </w:sdtPr>
+        <w:sdtEndPr/>
+        <w:sdtContent>
+          <w:r>
+            <w:fldChar w:fldCharType="begin"/>
+          </w:r>
+          <w:r>
+            <w:instrText xml:space="preserve"> CITATION Goo251 \l 3081 </w:instrText>
+          </w:r>
+          <w:r>
+            <w:fldChar w:fldCharType="separate"/>
+          </w:r>
+          <w:r>
+            <w:rPr>
+              <w:noProof/>
+            </w:rPr>
+            <w:t>(Google Gemini - Quantic Project Image Generation, 2025)</w:t>
+          </w:r>
+          <w:r>
+            <w:fldChar w:fldCharType="end"/>
+          </w:r>
+        </w:sdtContent>
+      </w:sdt>
     </w:p>
     <w:p>
       <w:pPr>
@@ -1454,12 +1849,7 @@
         <w:t>: Architecture choices, feature prioritization, testing strategy</w:t>
       </w:r>
       <w:r>
-        <w:t xml:space="preserve">, PostgreSQL implementation and </w:t>
-      </w:r>
-      <w:bookmarkStart w:id="4" w:name="_GoBack"/>
-      <w:bookmarkEnd w:id="4"/>
-      <w:r>
-        <w:t>setup</w:t>
+        <w:t>, PostgreSQL implementation and setup</w:t>
       </w:r>
       <w:r>
         <w:t>.</w:t>
@@ -1469,11 +1859,11 @@
       <w:pPr>
         <w:pStyle w:val="Heading3"/>
       </w:pPr>
-      <w:bookmarkStart w:id="5" w:name="_Toc217334122"/>
+      <w:bookmarkStart w:id="7" w:name="_Toc217440311"/>
       <w:r>
         <w:t>Learning Outcomes</w:t>
       </w:r>
-      <w:bookmarkEnd w:id="5"/>
+      <w:bookmarkEnd w:id="7"/>
     </w:p>
     <w:p>
       <w:r>
@@ -1547,21 +1937,22 @@
       <w:pPr>
         <w:pStyle w:val="Heading1"/>
       </w:pPr>
-      <w:bookmarkStart w:id="6" w:name="_Toc217334123"/>
-      <w:r>
+      <w:bookmarkStart w:id="8" w:name="_Toc217440312"/>
+      <w:r>
+        <w:lastRenderedPageBreak/>
         <w:t>Cross-Platform Testing</w:t>
       </w:r>
-      <w:bookmarkEnd w:id="6"/>
+      <w:bookmarkEnd w:id="8"/>
     </w:p>
     <w:p>
       <w:pPr>
         <w:pStyle w:val="Heading2"/>
       </w:pPr>
-      <w:bookmarkStart w:id="7" w:name="_Toc217334124"/>
+      <w:bookmarkStart w:id="9" w:name="_Toc217440313"/>
       <w:r>
         <w:t>Toolchain</w:t>
       </w:r>
-      <w:bookmarkEnd w:id="7"/>
+      <w:bookmarkEnd w:id="9"/>
     </w:p>
     <w:p>
       <w:pPr>
@@ -1602,7 +1993,7 @@
       <w:r>
         <w:t xml:space="preserve">for all the testing and staging in this project at the address; </w:t>
       </w:r>
-      <w:hyperlink r:id="rId9" w:history="1">
+      <w:hyperlink r:id="rId12" w:history="1">
         <w:r>
           <w:rPr>
             <w:rStyle w:val="Hyperlink"/>
@@ -1709,7 +2100,7 @@
         </w:rPr>
         <w:t xml:space="preserve">Also used the </w:t>
       </w:r>
-      <w:hyperlink r:id="rId10" w:history="1">
+      <w:hyperlink r:id="rId13" w:history="1">
         <w:r>
           <w:rPr>
             <w:rStyle w:val="Hyperlink"/>
@@ -1727,13 +2118,31 @@
     </w:p>
     <w:p>
       <w:pPr>
+        <w:rPr>
+          <w:rFonts w:cstheme="minorHAnsi"/>
+          <w:sz w:val="18"/>
+        </w:rPr>
+      </w:pPr>
+      <w:hyperlink r:id="rId14" w:history="1">
+        <w:r>
+          <w:rPr>
+            <w:rStyle w:val="Hyperlink"/>
+            <w:rFonts w:cstheme="minorHAnsi"/>
+            <w:sz w:val="18"/>
+          </w:rPr>
+          <w:t>https://chromewebstore.google.com/detail/mobile-simulator-responsi/ckejmhbmlajgoklhgbapkiccekfoccmk?hl=en</w:t>
+        </w:r>
+      </w:hyperlink>
+    </w:p>
+    <w:p>
+      <w:pPr>
         <w:pStyle w:val="Heading2"/>
       </w:pPr>
-      <w:bookmarkStart w:id="8" w:name="_Toc217334125"/>
+      <w:bookmarkStart w:id="10" w:name="_Toc217440314"/>
       <w:r>
         <w:t>Devices Selected for Testing</w:t>
       </w:r>
-      <w:bookmarkEnd w:id="8"/>
+      <w:bookmarkEnd w:id="10"/>
     </w:p>
     <w:p>
       <w:r>
@@ -1785,7 +2194,6 @@
         </w:numPr>
       </w:pPr>
       <w:r>
-        <w:lastRenderedPageBreak/>
         <w:t>iPad Air (820 x 1180)</w:t>
       </w:r>
     </w:p>
@@ -1877,11 +2285,11 @@
       <w:pPr>
         <w:pStyle w:val="Heading2"/>
       </w:pPr>
-      <w:bookmarkStart w:id="9" w:name="_Toc217334126"/>
+      <w:bookmarkStart w:id="11" w:name="_Toc217440315"/>
       <w:r>
         <w:t>Testing Scope</w:t>
       </w:r>
-      <w:bookmarkEnd w:id="9"/>
+      <w:bookmarkEnd w:id="11"/>
     </w:p>
     <w:p>
       <w:pPr>
@@ -1953,11 +2361,11 @@
       <w:pPr>
         <w:pStyle w:val="Heading3"/>
       </w:pPr>
-      <w:bookmarkStart w:id="10" w:name="_Toc217334127"/>
+      <w:bookmarkStart w:id="12" w:name="_Toc217440316"/>
       <w:r>
         <w:t>Testing Checklist</w:t>
       </w:r>
-      <w:bookmarkEnd w:id="10"/>
+      <w:bookmarkEnd w:id="12"/>
     </w:p>
     <w:p>
       <w:r>
@@ -2139,6 +2547,7 @@
         </w:numPr>
       </w:pPr>
       <w:r>
+        <w:lastRenderedPageBreak/>
         <w:t>Form fields are accessible?</w:t>
       </w:r>
     </w:p>
@@ -2265,16 +2674,47 @@
       <w:pPr>
         <w:pStyle w:val="Heading1"/>
       </w:pPr>
-      <w:bookmarkStart w:id="11" w:name="_Toc217334128"/>
-      <w:r>
-        <w:lastRenderedPageBreak/>
+      <w:bookmarkStart w:id="13" w:name="_Toc217440317"/>
+      <w:r>
         <w:t>Requirements Traceability Matrix</w:t>
       </w:r>
-      <w:bookmarkEnd w:id="11"/>
+      <w:bookmarkEnd w:id="13"/>
     </w:p>
     <w:p>
       <w:r>
         <w:t xml:space="preserve">Attached to the end of this document is an Excel table document exported Requirements Traceability Matrix used for tracking the features and development activities implemented and performed during the project sprint. </w:t>
+      </w:r>
+      <w:sdt>
+        <w:sdtPr>
+          <w:id w:val="-1506664897"/>
+          <w:citation/>
+        </w:sdtPr>
+        <w:sdtEndPr/>
+        <w:sdtContent>
+          <w:r>
+            <w:fldChar w:fldCharType="begin"/>
+          </w:r>
+          <w:r>
+            <w:instrText xml:space="preserve"> CITATION Cla25 \l 3081 </w:instrText>
+          </w:r>
+          <w:r>
+            <w:fldChar w:fldCharType="separate"/>
+          </w:r>
+          <w:r>
+            <w:rPr>
+              <w:noProof/>
+            </w:rPr>
+            <w:t>(Claude AI - Prompts for Project Draft Website Structure (Program Setup Troubleshooting), 2025)</w:t>
+          </w:r>
+          <w:r>
+            <w:fldChar w:fldCharType="end"/>
+          </w:r>
+        </w:sdtContent>
+      </w:sdt>
+    </w:p>
+    <w:p>
+      <w:r>
+        <w:t xml:space="preserve">AI has been used for sorting the matrix into a table for input into Excel and sorting them into their correct categories. </w:t>
       </w:r>
     </w:p>
     <w:p>
@@ -2306,22 +2746,22 @@
         <w:br w:type="page"/>
       </w:r>
     </w:p>
+    <w:bookmarkStart w:id="14" w:name="_Toc217440318" w:displacedByCustomXml="next"/>
     <w:sdt>
       <w:sdtPr>
+        <w:rPr>
+          <w:rFonts w:asciiTheme="minorHAnsi" w:eastAsiaTheme="minorHAnsi" w:hAnsiTheme="minorHAnsi" w:cstheme="minorBidi"/>
+          <w:color w:val="auto"/>
+          <w:sz w:val="22"/>
+          <w:szCs w:val="22"/>
+        </w:rPr>
         <w:id w:val="-786733584"/>
         <w:docPartObj>
           <w:docPartGallery w:val="Bibliographies"/>
           <w:docPartUnique/>
         </w:docPartObj>
       </w:sdtPr>
-      <w:sdtEndPr>
-        <w:rPr>
-          <w:rFonts w:asciiTheme="minorHAnsi" w:eastAsiaTheme="minorHAnsi" w:hAnsiTheme="minorHAnsi" w:cstheme="minorBidi"/>
-          <w:color w:val="auto"/>
-          <w:sz w:val="22"/>
-          <w:szCs w:val="22"/>
-        </w:rPr>
-      </w:sdtEndPr>
+      <w:sdtEndPr/>
       <w:sdtContent>
         <w:p>
           <w:pPr>
@@ -2330,14 +2770,25 @@
           <w:r>
             <w:t>References</w:t>
           </w:r>
+          <w:bookmarkEnd w:id="14"/>
         </w:p>
         <w:sdt>
           <w:sdtPr>
             <w:id w:val="-573587230"/>
             <w:bibliography/>
           </w:sdtPr>
+          <w:sdtEndPr/>
           <w:sdtContent>
             <w:p>
+              <w:pPr>
+                <w:pStyle w:val="Bibliography"/>
+                <w:ind w:left="720" w:hanging="720"/>
+                <w:rPr>
+                  <w:noProof/>
+                  <w:sz w:val="24"/>
+                  <w:szCs w:val="24"/>
+                </w:rPr>
+              </w:pPr>
               <w:r>
                 <w:fldChar w:fldCharType="begin"/>
               </w:r>
@@ -2349,13 +2800,43 @@
               </w:r>
               <w:r>
                 <w:rPr>
-                  <w:b/>
-                  <w:bCs/>
+                  <w:i/>
+                  <w:iCs/>
                   <w:noProof/>
-                  <w:lang w:val="en-US"/>
                 </w:rPr>
-                <w:t>There are no sources in the current document.</w:t>
+                <w:t>Claude AI - Prompts for Project Draft Website Structure (Program Setup Troubleshooting)</w:t>
               </w:r>
+              <w:r>
+                <w:rPr>
+                  <w:noProof/>
+                </w:rPr>
+                <w:t>. (2025). Retrieved from Claude AI: https://claude.ai/</w:t>
+              </w:r>
+            </w:p>
+            <w:p>
+              <w:pPr>
+                <w:pStyle w:val="Bibliography"/>
+                <w:ind w:left="720" w:hanging="720"/>
+                <w:rPr>
+                  <w:noProof/>
+                </w:rPr>
+              </w:pPr>
+              <w:r>
+                <w:rPr>
+                  <w:i/>
+                  <w:iCs/>
+                  <w:noProof/>
+                </w:rPr>
+                <w:t>Google Gemini - Quantic Project Image Generation</w:t>
+              </w:r>
+              <w:r>
+                <w:rPr>
+                  <w:noProof/>
+                </w:rPr>
+                <w:t>. (2025). Retrieved from Google Gemini: https://gemini.google.com/</w:t>
+              </w:r>
+            </w:p>
+            <w:p>
               <w:r>
                 <w:rPr>
                   <w:b/>
@@ -2371,8 +2852,8 @@
     </w:sdt>
     <w:p/>
     <w:sectPr>
-      <w:headerReference w:type="default" r:id="rId11"/>
-      <w:footerReference w:type="default" r:id="rId12"/>
+      <w:headerReference w:type="default" r:id="rId15"/>
+      <w:footerReference w:type="default" r:id="rId16"/>
       <w:pgSz w:w="11906" w:h="16838"/>
       <w:pgMar w:top="1440" w:right="1440" w:bottom="1440" w:left="1440" w:header="708" w:footer="708" w:gutter="0"/>
       <w:pgNumType w:start="0"/>
@@ -2753,7 +3234,7 @@
         <w:rFonts w:ascii="Symbol" w:hAnsi="Symbol" w:hint="default"/>
       </w:rPr>
     </w:lvl>
-    <w:lvl w:ilvl="1" w:tplc="0C090003" w:tentative="1">
+    <w:lvl w:ilvl="1" w:tplc="0C090003">
       <w:start w:val="1"/>
       <w:numFmt w:val="bullet"/>
       <w:lvlText w:val="o"/>
@@ -2851,6 +3332,119 @@
     </w:lvl>
   </w:abstractNum>
   <w:abstractNum w:abstractNumId="3" w15:restartNumberingAfterBreak="0">
+    <w:nsid w:val="1DA446B0"/>
+    <w:multiLevelType w:val="hybridMultilevel"/>
+    <w:tmpl w:val="3870700E"/>
+    <w:lvl w:ilvl="0" w:tplc="C0C28AD2">
+      <w:numFmt w:val="bullet"/>
+      <w:lvlText w:val="-"/>
+      <w:lvlJc w:val="left"/>
+      <w:pPr>
+        <w:ind w:left="720" w:hanging="360"/>
+      </w:pPr>
+      <w:rPr>
+        <w:rFonts w:ascii="Calibri" w:eastAsiaTheme="minorHAnsi" w:hAnsi="Calibri" w:cs="Calibri" w:hint="default"/>
+        <w:b/>
+      </w:rPr>
+    </w:lvl>
+    <w:lvl w:ilvl="1" w:tplc="0C090003" w:tentative="1">
+      <w:start w:val="1"/>
+      <w:numFmt w:val="bullet"/>
+      <w:lvlText w:val="o"/>
+      <w:lvlJc w:val="left"/>
+      <w:pPr>
+        <w:ind w:left="1440" w:hanging="360"/>
+      </w:pPr>
+      <w:rPr>
+        <w:rFonts w:ascii="Courier New" w:hAnsi="Courier New" w:cs="Courier New" w:hint="default"/>
+      </w:rPr>
+    </w:lvl>
+    <w:lvl w:ilvl="2" w:tplc="0C090005" w:tentative="1">
+      <w:start w:val="1"/>
+      <w:numFmt w:val="bullet"/>
+      <w:lvlText w:val=""/>
+      <w:lvlJc w:val="left"/>
+      <w:pPr>
+        <w:ind w:left="2160" w:hanging="360"/>
+      </w:pPr>
+      <w:rPr>
+        <w:rFonts w:ascii="Wingdings" w:hAnsi="Wingdings" w:hint="default"/>
+      </w:rPr>
+    </w:lvl>
+    <w:lvl w:ilvl="3" w:tplc="0C090001" w:tentative="1">
+      <w:start w:val="1"/>
+      <w:numFmt w:val="bullet"/>
+      <w:lvlText w:val=""/>
+      <w:lvlJc w:val="left"/>
+      <w:pPr>
+        <w:ind w:left="2880" w:hanging="360"/>
+      </w:pPr>
+      <w:rPr>
+        <w:rFonts w:ascii="Symbol" w:hAnsi="Symbol" w:hint="default"/>
+      </w:rPr>
+    </w:lvl>
+    <w:lvl w:ilvl="4" w:tplc="0C090003" w:tentative="1">
+      <w:start w:val="1"/>
+      <w:numFmt w:val="bullet"/>
+      <w:lvlText w:val="o"/>
+      <w:lvlJc w:val="left"/>
+      <w:pPr>
+        <w:ind w:left="3600" w:hanging="360"/>
+      </w:pPr>
+      <w:rPr>
+        <w:rFonts w:ascii="Courier New" w:hAnsi="Courier New" w:cs="Courier New" w:hint="default"/>
+      </w:rPr>
+    </w:lvl>
+    <w:lvl w:ilvl="5" w:tplc="0C090005" w:tentative="1">
+      <w:start w:val="1"/>
+      <w:numFmt w:val="bullet"/>
+      <w:lvlText w:val=""/>
+      <w:lvlJc w:val="left"/>
+      <w:pPr>
+        <w:ind w:left="4320" w:hanging="360"/>
+      </w:pPr>
+      <w:rPr>
+        <w:rFonts w:ascii="Wingdings" w:hAnsi="Wingdings" w:hint="default"/>
+      </w:rPr>
+    </w:lvl>
+    <w:lvl w:ilvl="6" w:tplc="0C090001" w:tentative="1">
+      <w:start w:val="1"/>
+      <w:numFmt w:val="bullet"/>
+      <w:lvlText w:val=""/>
+      <w:lvlJc w:val="left"/>
+      <w:pPr>
+        <w:ind w:left="5040" w:hanging="360"/>
+      </w:pPr>
+      <w:rPr>
+        <w:rFonts w:ascii="Symbol" w:hAnsi="Symbol" w:hint="default"/>
+      </w:rPr>
+    </w:lvl>
+    <w:lvl w:ilvl="7" w:tplc="0C090003" w:tentative="1">
+      <w:start w:val="1"/>
+      <w:numFmt w:val="bullet"/>
+      <w:lvlText w:val="o"/>
+      <w:lvlJc w:val="left"/>
+      <w:pPr>
+        <w:ind w:left="5760" w:hanging="360"/>
+      </w:pPr>
+      <w:rPr>
+        <w:rFonts w:ascii="Courier New" w:hAnsi="Courier New" w:cs="Courier New" w:hint="default"/>
+      </w:rPr>
+    </w:lvl>
+    <w:lvl w:ilvl="8" w:tplc="0C090005" w:tentative="1">
+      <w:start w:val="1"/>
+      <w:numFmt w:val="bullet"/>
+      <w:lvlText w:val=""/>
+      <w:lvlJc w:val="left"/>
+      <w:pPr>
+        <w:ind w:left="6480" w:hanging="360"/>
+      </w:pPr>
+      <w:rPr>
+        <w:rFonts w:ascii="Wingdings" w:hAnsi="Wingdings" w:hint="default"/>
+      </w:rPr>
+    </w:lvl>
+  </w:abstractNum>
+  <w:abstractNum w:abstractNumId="4" w15:restartNumberingAfterBreak="0">
     <w:nsid w:val="1E4E3F3B"/>
     <w:multiLevelType w:val="hybridMultilevel"/>
     <w:tmpl w:val="FCBAF5C4"/>
@@ -2963,7 +3557,7 @@
       </w:rPr>
     </w:lvl>
   </w:abstractNum>
-  <w:abstractNum w:abstractNumId="4" w15:restartNumberingAfterBreak="0">
+  <w:abstractNum w:abstractNumId="5" w15:restartNumberingAfterBreak="0">
     <w:nsid w:val="2A663CB4"/>
     <w:multiLevelType w:val="hybridMultilevel"/>
     <w:tmpl w:val="2396893C"/>
@@ -3052,7 +3646,7 @@
       </w:pPr>
     </w:lvl>
   </w:abstractNum>
-  <w:abstractNum w:abstractNumId="5" w15:restartNumberingAfterBreak="0">
+  <w:abstractNum w:abstractNumId="6" w15:restartNumberingAfterBreak="0">
     <w:nsid w:val="2DCE6386"/>
     <w:multiLevelType w:val="hybridMultilevel"/>
     <w:tmpl w:val="CABC1D0E"/>
@@ -3165,7 +3759,7 @@
       </w:rPr>
     </w:lvl>
   </w:abstractNum>
-  <w:abstractNum w:abstractNumId="6" w15:restartNumberingAfterBreak="0">
+  <w:abstractNum w:abstractNumId="7" w15:restartNumberingAfterBreak="0">
     <w:nsid w:val="37C41BB0"/>
     <w:multiLevelType w:val="hybridMultilevel"/>
     <w:tmpl w:val="AF1E8616"/>
@@ -3278,7 +3872,7 @@
       </w:rPr>
     </w:lvl>
   </w:abstractNum>
-  <w:abstractNum w:abstractNumId="7" w15:restartNumberingAfterBreak="0">
+  <w:abstractNum w:abstractNumId="8" w15:restartNumberingAfterBreak="0">
     <w:nsid w:val="39FD60A7"/>
     <w:multiLevelType w:val="hybridMultilevel"/>
     <w:tmpl w:val="47421362"/>
@@ -3391,7 +3985,7 @@
       </w:rPr>
     </w:lvl>
   </w:abstractNum>
-  <w:abstractNum w:abstractNumId="8" w15:restartNumberingAfterBreak="0">
+  <w:abstractNum w:abstractNumId="9" w15:restartNumberingAfterBreak="0">
     <w:nsid w:val="44401746"/>
     <w:multiLevelType w:val="hybridMultilevel"/>
     <w:tmpl w:val="1538766E"/>
@@ -3504,7 +4098,7 @@
       </w:rPr>
     </w:lvl>
   </w:abstractNum>
-  <w:abstractNum w:abstractNumId="9" w15:restartNumberingAfterBreak="0">
+  <w:abstractNum w:abstractNumId="10" w15:restartNumberingAfterBreak="0">
     <w:nsid w:val="4AD7655C"/>
     <w:multiLevelType w:val="hybridMultilevel"/>
     <w:tmpl w:val="98DA5F72"/>
@@ -3617,7 +4211,7 @@
       </w:rPr>
     </w:lvl>
   </w:abstractNum>
-  <w:abstractNum w:abstractNumId="10" w15:restartNumberingAfterBreak="0">
+  <w:abstractNum w:abstractNumId="11" w15:restartNumberingAfterBreak="0">
     <w:nsid w:val="4E111A51"/>
     <w:multiLevelType w:val="hybridMultilevel"/>
     <w:tmpl w:val="83C6C33E"/>
@@ -3703,7 +4297,7 @@
       </w:pPr>
     </w:lvl>
   </w:abstractNum>
-  <w:abstractNum w:abstractNumId="11" w15:restartNumberingAfterBreak="0">
+  <w:abstractNum w:abstractNumId="12" w15:restartNumberingAfterBreak="0">
     <w:nsid w:val="512712D0"/>
     <w:multiLevelType w:val="hybridMultilevel"/>
     <w:tmpl w:val="C4BE4A80"/>
@@ -3816,7 +4410,7 @@
       </w:rPr>
     </w:lvl>
   </w:abstractNum>
-  <w:abstractNum w:abstractNumId="12" w15:restartNumberingAfterBreak="0">
+  <w:abstractNum w:abstractNumId="13" w15:restartNumberingAfterBreak="0">
     <w:nsid w:val="54E757C5"/>
     <w:multiLevelType w:val="hybridMultilevel"/>
     <w:tmpl w:val="35462100"/>
@@ -3905,7 +4499,7 @@
       </w:pPr>
     </w:lvl>
   </w:abstractNum>
-  <w:abstractNum w:abstractNumId="13" w15:restartNumberingAfterBreak="0">
+  <w:abstractNum w:abstractNumId="14" w15:restartNumberingAfterBreak="0">
     <w:nsid w:val="59985867"/>
     <w:multiLevelType w:val="hybridMultilevel"/>
     <w:tmpl w:val="77A6BC0A"/>
@@ -4018,7 +4612,7 @@
       </w:rPr>
     </w:lvl>
   </w:abstractNum>
-  <w:abstractNum w:abstractNumId="14" w15:restartNumberingAfterBreak="0">
+  <w:abstractNum w:abstractNumId="15" w15:restartNumberingAfterBreak="0">
     <w:nsid w:val="5F9B787C"/>
     <w:multiLevelType w:val="hybridMultilevel"/>
     <w:tmpl w:val="00AADF98"/>
@@ -4131,7 +4725,7 @@
       </w:rPr>
     </w:lvl>
   </w:abstractNum>
-  <w:abstractNum w:abstractNumId="15" w15:restartNumberingAfterBreak="0">
+  <w:abstractNum w:abstractNumId="16" w15:restartNumberingAfterBreak="0">
     <w:nsid w:val="7CD9726E"/>
     <w:multiLevelType w:val="hybridMultilevel"/>
     <w:tmpl w:val="0E923D36"/>
@@ -4244,53 +4838,172 @@
       </w:rPr>
     </w:lvl>
   </w:abstractNum>
+  <w:abstractNum w:abstractNumId="17" w15:restartNumberingAfterBreak="0">
+    <w:nsid w:val="7FD02D24"/>
+    <w:multiLevelType w:val="hybridMultilevel"/>
+    <w:tmpl w:val="198673A8"/>
+    <w:lvl w:ilvl="0" w:tplc="C0C28AD2">
+      <w:numFmt w:val="bullet"/>
+      <w:lvlText w:val="-"/>
+      <w:lvlJc w:val="left"/>
+      <w:pPr>
+        <w:ind w:left="720" w:hanging="360"/>
+      </w:pPr>
+      <w:rPr>
+        <w:rFonts w:ascii="Calibri" w:eastAsiaTheme="minorHAnsi" w:hAnsi="Calibri" w:cs="Calibri" w:hint="default"/>
+        <w:b/>
+      </w:rPr>
+    </w:lvl>
+    <w:lvl w:ilvl="1" w:tplc="0C090003" w:tentative="1">
+      <w:start w:val="1"/>
+      <w:numFmt w:val="bullet"/>
+      <w:lvlText w:val="o"/>
+      <w:lvlJc w:val="left"/>
+      <w:pPr>
+        <w:ind w:left="1440" w:hanging="360"/>
+      </w:pPr>
+      <w:rPr>
+        <w:rFonts w:ascii="Courier New" w:hAnsi="Courier New" w:cs="Courier New" w:hint="default"/>
+      </w:rPr>
+    </w:lvl>
+    <w:lvl w:ilvl="2" w:tplc="0C090005" w:tentative="1">
+      <w:start w:val="1"/>
+      <w:numFmt w:val="bullet"/>
+      <w:lvlText w:val=""/>
+      <w:lvlJc w:val="left"/>
+      <w:pPr>
+        <w:ind w:left="2160" w:hanging="360"/>
+      </w:pPr>
+      <w:rPr>
+        <w:rFonts w:ascii="Wingdings" w:hAnsi="Wingdings" w:hint="default"/>
+      </w:rPr>
+    </w:lvl>
+    <w:lvl w:ilvl="3" w:tplc="0C090001" w:tentative="1">
+      <w:start w:val="1"/>
+      <w:numFmt w:val="bullet"/>
+      <w:lvlText w:val=""/>
+      <w:lvlJc w:val="left"/>
+      <w:pPr>
+        <w:ind w:left="2880" w:hanging="360"/>
+      </w:pPr>
+      <w:rPr>
+        <w:rFonts w:ascii="Symbol" w:hAnsi="Symbol" w:hint="default"/>
+      </w:rPr>
+    </w:lvl>
+    <w:lvl w:ilvl="4" w:tplc="0C090003" w:tentative="1">
+      <w:start w:val="1"/>
+      <w:numFmt w:val="bullet"/>
+      <w:lvlText w:val="o"/>
+      <w:lvlJc w:val="left"/>
+      <w:pPr>
+        <w:ind w:left="3600" w:hanging="360"/>
+      </w:pPr>
+      <w:rPr>
+        <w:rFonts w:ascii="Courier New" w:hAnsi="Courier New" w:cs="Courier New" w:hint="default"/>
+      </w:rPr>
+    </w:lvl>
+    <w:lvl w:ilvl="5" w:tplc="0C090005" w:tentative="1">
+      <w:start w:val="1"/>
+      <w:numFmt w:val="bullet"/>
+      <w:lvlText w:val=""/>
+      <w:lvlJc w:val="left"/>
+      <w:pPr>
+        <w:ind w:left="4320" w:hanging="360"/>
+      </w:pPr>
+      <w:rPr>
+        <w:rFonts w:ascii="Wingdings" w:hAnsi="Wingdings" w:hint="default"/>
+      </w:rPr>
+    </w:lvl>
+    <w:lvl w:ilvl="6" w:tplc="0C090001" w:tentative="1">
+      <w:start w:val="1"/>
+      <w:numFmt w:val="bullet"/>
+      <w:lvlText w:val=""/>
+      <w:lvlJc w:val="left"/>
+      <w:pPr>
+        <w:ind w:left="5040" w:hanging="360"/>
+      </w:pPr>
+      <w:rPr>
+        <w:rFonts w:ascii="Symbol" w:hAnsi="Symbol" w:hint="default"/>
+      </w:rPr>
+    </w:lvl>
+    <w:lvl w:ilvl="7" w:tplc="0C090003" w:tentative="1">
+      <w:start w:val="1"/>
+      <w:numFmt w:val="bullet"/>
+      <w:lvlText w:val="o"/>
+      <w:lvlJc w:val="left"/>
+      <w:pPr>
+        <w:ind w:left="5760" w:hanging="360"/>
+      </w:pPr>
+      <w:rPr>
+        <w:rFonts w:ascii="Courier New" w:hAnsi="Courier New" w:cs="Courier New" w:hint="default"/>
+      </w:rPr>
+    </w:lvl>
+    <w:lvl w:ilvl="8" w:tplc="0C090005" w:tentative="1">
+      <w:start w:val="1"/>
+      <w:numFmt w:val="bullet"/>
+      <w:lvlText w:val=""/>
+      <w:lvlJc w:val="left"/>
+      <w:pPr>
+        <w:ind w:left="6480" w:hanging="360"/>
+      </w:pPr>
+      <w:rPr>
+        <w:rFonts w:ascii="Wingdings" w:hAnsi="Wingdings" w:hint="default"/>
+      </w:rPr>
+    </w:lvl>
+  </w:abstractNum>
   <w:num w:numId="1">
-    <w:abstractNumId w:val="4"/>
+    <w:abstractNumId w:val="5"/>
   </w:num>
   <w:num w:numId="2">
-    <w:abstractNumId w:val="10"/>
+    <w:abstractNumId w:val="11"/>
   </w:num>
   <w:num w:numId="3">
     <w:abstractNumId w:val="2"/>
   </w:num>
   <w:num w:numId="4">
-    <w:abstractNumId w:val="5"/>
+    <w:abstractNumId w:val="6"/>
   </w:num>
   <w:num w:numId="5">
     <w:abstractNumId w:val="0"/>
   </w:num>
   <w:num w:numId="6">
-    <w:abstractNumId w:val="9"/>
+    <w:abstractNumId w:val="10"/>
   </w:num>
   <w:num w:numId="7">
+    <w:abstractNumId w:val="14"/>
+  </w:num>
+  <w:num w:numId="8">
     <w:abstractNumId w:val="13"/>
   </w:num>
-  <w:num w:numId="8">
-    <w:abstractNumId w:val="12"/>
-  </w:num>
   <w:num w:numId="9">
-    <w:abstractNumId w:val="15"/>
+    <w:abstractNumId w:val="16"/>
   </w:num>
   <w:num w:numId="10">
-    <w:abstractNumId w:val="7"/>
+    <w:abstractNumId w:val="8"/>
   </w:num>
   <w:num w:numId="11">
     <w:abstractNumId w:val="1"/>
   </w:num>
   <w:num w:numId="12">
+    <w:abstractNumId w:val="4"/>
+  </w:num>
+  <w:num w:numId="13">
+    <w:abstractNumId w:val="15"/>
+  </w:num>
+  <w:num w:numId="14">
+    <w:abstractNumId w:val="12"/>
+  </w:num>
+  <w:num w:numId="15">
+    <w:abstractNumId w:val="7"/>
+  </w:num>
+  <w:num w:numId="16">
+    <w:abstractNumId w:val="9"/>
+  </w:num>
+  <w:num w:numId="17">
     <w:abstractNumId w:val="3"/>
   </w:num>
-  <w:num w:numId="13">
-    <w:abstractNumId w:val="14"/>
-  </w:num>
-  <w:num w:numId="14">
-    <w:abstractNumId w:val="11"/>
-  </w:num>
-  <w:num w:numId="15">
-    <w:abstractNumId w:val="6"/>
-  </w:num>
-  <w:num w:numId="16">
-    <w:abstractNumId w:val="8"/>
+  <w:num w:numId="18">
+    <w:abstractNumId w:val="17"/>
   </w:num>
 </w:numbering>
 </file>
@@ -5266,6 +5979,14 @@
       <w:iCs/>
     </w:rPr>
   </w:style>
+  <w:style w:type="paragraph" w:styleId="Bibliography">
+    <w:name w:val="Bibliography"/>
+    <w:basedOn w:val="Normal"/>
+    <w:next w:val="Normal"/>
+    <w:uiPriority w:val="37"/>
+    <w:unhideWhenUsed/>
+    <w:rsid w:val="009559EB"/>
+  </w:style>
 </w:styles>
 </file>
 
@@ -5480,9 +6201,8 @@
     <w:panose1 w:val="020B0502040204020203"/>
     <w:charset w:val="00"/>
     <w:family w:val="swiss"/>
-    <w:notTrueType/>
     <w:pitch w:val="variable"/>
-    <w:sig w:usb0="00000003" w:usb1="00000000" w:usb2="00000000" w:usb3="00000000" w:csb0="00000001" w:csb1="00000000"/>
+    <w:sig w:usb0="E4002EFF" w:usb1="C000E47F" w:usb2="00000009" w:usb3="00000000" w:csb0="000001FF" w:csb1="00000000"/>
   </w:font>
 </w:fonts>
 </file>
@@ -5503,8 +6223,12 @@
   <w:rsids>
     <w:rsidRoot w:val="00A814C6"/>
     <w:rsid w:val="001E47EF"/>
+    <w:rsid w:val="004518EA"/>
+    <w:rsid w:val="005027CD"/>
     <w:rsid w:val="007277D6"/>
     <w:rsid w:val="00A814C6"/>
+    <w:rsid w:val="00AA4642"/>
+    <w:rsid w:val="00B36906"/>
     <w:rsid w:val="00F226AD"/>
   </w:rsids>
   <m:mathPr>
@@ -6252,7 +6976,28 @@
 </file>
 
 <file path=customXml/item2.xml><?xml version="1.0" encoding="utf-8"?>
-<b:Sources xmlns:b="http://schemas.openxmlformats.org/officeDocument/2006/bibliography" xmlns="http://schemas.openxmlformats.org/officeDocument/2006/bibliography" SelectedStyle="\APASixthEditionOfficeOnline.xsl" StyleName="APA" Version="6"/>
+<b:Sources xmlns:b="http://schemas.openxmlformats.org/officeDocument/2006/bibliography" xmlns="http://schemas.openxmlformats.org/officeDocument/2006/bibliography" SelectedStyle="\APASixthEditionOfficeOnline.xsl" StyleName="APA" Version="6">
+  <b:Source>
+    <b:Tag>Goo251</b:Tag>
+    <b:SourceType>InternetSite</b:SourceType>
+    <b:Guid>{ED3E8543-855F-4E5A-B4CE-53761E0910CD}</b:Guid>
+    <b:Title>Google Gemini - Quantic Project Image Generation</b:Title>
+    <b:InternetSiteTitle>Google Gemini</b:InternetSiteTitle>
+    <b:Year>2025</b:Year>
+    <b:URL>https://gemini.google.com/</b:URL>
+    <b:RefOrder>2</b:RefOrder>
+  </b:Source>
+  <b:Source>
+    <b:Tag>Cla25</b:Tag>
+    <b:SourceType>InternetSite</b:SourceType>
+    <b:Guid>{33C123B9-5F4A-4275-96ED-21E5BE940BF7}</b:Guid>
+    <b:Title>Claude AI - Prompts for Project Draft Website Structure (Program Setup Troubleshooting)</b:Title>
+    <b:InternetSiteTitle>Claude AI</b:InternetSiteTitle>
+    <b:Year>2025</b:Year>
+    <b:URL>https://claude.ai/</b:URL>
+    <b:RefOrder>1</b:RefOrder>
+  </b:Source>
+</b:Sources>
 </file>
 
 <file path=customXml/itemProps1.xml><?xml version="1.0" encoding="utf-8"?>
@@ -6264,7 +7009,7 @@
 </file>
 
 <file path=customXml/itemProps2.xml><?xml version="1.0" encoding="utf-8"?>
-<ds:datastoreItem xmlns:ds="http://schemas.openxmlformats.org/officeDocument/2006/customXml" ds:itemID="{462FA7C3-39D6-413D-93F6-6B2EBF165F1D}">
+<ds:datastoreItem xmlns:ds="http://schemas.openxmlformats.org/officeDocument/2006/customXml" ds:itemID="{EEF6D145-13C6-461A-A5F4-38375664CF69}">
   <ds:schemaRefs>
     <ds:schemaRef ds:uri="http://schemas.openxmlformats.org/officeDocument/2006/bibliography"/>
   </ds:schemaRefs>

</xml_diff>